<commit_message>
Regenerate PDF/DOCX exports for the LOI pricing fix
Rebuilds all appendix PDFs and the merged DEQUAD_UKES_FULL_SUBMISSION.pdf
via build_ukes_pdf.py, and the H_university_letter_of_interest_template
/Full Submission DOCX exports via pandoc.

Co-Authored-By: Claude Sonnet 5 <noreply@anthropic.com>
</commit_message>
<xml_diff>
--- a/visa_appendices/docx/H_university_letter_of_interest_template.docx
+++ b/visa_appendices/docx/H_university_letter_of_interest_template.docx
@@ -2,14 +2,6 @@
 <file path=word/document.xml><?xml version="1.0" encoding="utf-8"?>
 <w:document xmlns:w="http://schemas.openxmlformats.org/wordprocessingml/2006/main" xmlns:m="http://schemas.openxmlformats.org/officeDocument/2006/math" xmlns:r="http://schemas.openxmlformats.org/officeDocument/2006/relationships" xmlns:o="urn:schemas-microsoft-com:office:office" xmlns:v="urn:schemas-microsoft-com:vml" xmlns:w10="urn:schemas-microsoft-com:office:word" xmlns:a="http://schemas.openxmlformats.org/drawingml/2006/main" xmlns:pic="http://schemas.openxmlformats.org/drawingml/2006/picture" xmlns:wp="http://schemas.openxmlformats.org/drawingml/2006/wordprocessingDrawing">
   <w:body>
-    <w:p>
-      <w:pPr>
-        <w:pStyle w:val="Title"/>
-      </w:pPr>
-      <w:r>
-        <w:t xml:space="preserve">H_university_letter_of_interest_template</w:t>
-      </w:r>
-    </w:p>
     <w:bookmarkStart w:id="18" w:name="X24989954b61eee74b7802fb6c44540b28e9ba61"/>
     <w:p>
       <w:pPr>
@@ -459,7 +451,7 @@
           <w:b/>
           <w:bCs/>
         </w:rPr>
-        <w:t xml:space="preserve">£1.50 per enrolled student per annum</w:t>
+        <w:t xml:space="preserve">£2.00 per enrolled student per annum</w:t>
       </w:r>
       <w:r>
         <w:t xml:space="preserve"> </w:t>

</xml_diff>